<commit_message>
Cannot generate commit message: Failed to generate diff details
</commit_message>
<xml_diff>
--- a/BotCraft_資訊應用服務創新創業新秀選拔_初審報告.docx
+++ b/BotCraft_資訊應用服務創新創業新秀選拔_初審報告.docx
@@ -310,7 +310,7 @@
         <w:ind w:leftChars="-24" w:left="-67" w:firstLineChars="50" w:firstLine="140"/>
         <w:jc w:val="both"/>
         <w:rPr>
-          <w:rFonts w:ascii="Times New Roman" w:hAnsi="Times New Roman" w:cs="Times New Roman"/>
+          <w:rFonts w:ascii="Times New Roman" w:hAnsi="Times New Roman" w:cs="Times New Roman" w:hint="eastAsia"/>
           <w:color w:val="000000" w:themeColor="text1"/>
           <w:sz w:val="32"/>
           <w:szCs w:val="32"/>
@@ -318,7 +318,13 @@
         </w:rPr>
       </w:pPr>
       <w:r>
-        <w:t>公司/團隊名稱 : BotCraft 團隊（目前由本人一人負責；正式送件前請確認登記名稱）</w:t>
+        <w:t xml:space="preserve">公司/團隊名稱 : </w:t>
+      </w:r>
+      <w:r>
+        <w:rPr>
+          <w:rFonts w:hint="eastAsia"/>
+        </w:rPr>
+        <w:t>一人打天下</w:t>
       </w:r>
     </w:p>
     <w:p>
@@ -1045,7 +1051,25 @@
         <w:ind w:left="420" w:hanging="420"/>
       </w:pPr>
       <w:r>
-        <w:t>（一）LINE-first 的低門檻 AI 服務建置：台灣中小店家多已擁有 LINE 官方帳號，但要導入 Messaging API、AI 問答與後台資料管理仍需技術人員。BotCraft 將建立 Bot、設計互動、上傳知識、啟用 AI 與檢視成效整合為同一工作流。</w:t>
+        <w:t>（一）LINE-first 的低門檻 AI 服務建置：台灣中小店家多已擁有 LINE 官方帳號，但要導入 Messaging API、AI 問答與後台資料管理仍需</w:t>
+      </w:r>
+      <w:r>
+        <w:rPr>
+          <w:rFonts w:hint="eastAsia"/>
+        </w:rPr>
+        <w:t>開發</w:t>
+      </w:r>
+      <w:r>
+        <w:t>人員</w:t>
+      </w:r>
+      <w:r>
+        <w:rPr>
+          <w:rFonts w:hint="eastAsia"/>
+        </w:rPr>
+        <w:t>協助</w:t>
+      </w:r>
+      <w:r>
+        <w:t>。BotCraft 將建立 Bot、設計互動、上傳知識、啟用 AI 與檢視成效整合為同一工作流。</w:t>
       </w:r>
     </w:p>
     <w:p>
@@ -1054,7 +1078,25 @@
         <w:ind w:left="420" w:hanging="420"/>
       </w:pPr>
       <w:r>
-        <w:t>（二）視覺化流程降低重複開發成本：以事件積木、條件積木、回覆積木、Flex Message 與 Rich Menu 設計器，讓活動規則、常見問題、加入好友歡迎、會員導流等流程可由營運者自行調整。</w:t>
+        <w:t>（二）視覺化流程降低重複開發成本：以事件積木、條件積木、回覆積木、Flex Message 與 Rich Menu 設計</w:t>
+      </w:r>
+      <w:r>
+        <w:rPr>
+          <w:rFonts w:hint="eastAsia"/>
+        </w:rPr>
+        <w:t>頁面</w:t>
+      </w:r>
+      <w:r>
+        <w:t>，讓活動規則、常見問題、加入好友歡迎、會員導流等流程可由</w:t>
+      </w:r>
+      <w:r>
+        <w:rPr>
+          <w:rFonts w:hint="eastAsia"/>
+        </w:rPr>
+        <w:t>使用者</w:t>
+      </w:r>
+      <w:r>
+        <w:t>自行調整。</w:t>
       </w:r>
     </w:p>
     <w:p>
@@ -1076,9 +1118,21 @@
       </w:r>
       <w:r>
         <w:rPr>
-          <w:rFonts w:ascii="Times New Roman" w:hAnsi="Times New Roman"/>
-        </w:rPr>
-        <w:t>接管與知識庫回答：平台先判斷使用者問題是否需要查詢管理者上傳的資料，再依檔案摘要與原文內容選取可參考文件生成短回覆；若資料不足，系統採保守回覆，管理者可再由後台人工介入，降低幻覺與錯答風險。</w:t>
+          <w:rFonts w:ascii="Times New Roman" w:hAnsi="Times New Roman" w:hint="eastAsia"/>
+        </w:rPr>
+        <w:t>回覆功能</w:t>
+      </w:r>
+      <w:r>
+        <w:rPr>
+          <w:rFonts w:ascii="Times New Roman" w:hAnsi="Times New Roman" w:hint="eastAsia"/>
+        </w:rPr>
+        <w:t>與</w:t>
+      </w:r>
+      <w:r>
+        <w:rPr>
+          <w:rFonts w:ascii="Times New Roman" w:hAnsi="Times New Roman"/>
+        </w:rPr>
+        <w:t>知識庫回答：平台先判斷使用者問題是否需要查詢管理者上傳的資料，再依檔案摘要與原文內容選取可參考文件生成回覆；若資料不足，系統採保守回覆，管理者可再由後台人工介入，降低幻覺與錯答風險。</w:t>
       </w:r>
     </w:p>
     <w:p>
@@ -1594,19 +1648,7 @@
         <w:rPr>
           <w:rFonts w:ascii="Times New Roman" w:hAnsi="Times New Roman"/>
         </w:rPr>
-        <w:t>初期市場估算採小規模驗證方式。依本專案首頁</w:t>
-      </w:r>
-      <w:r>
-        <w:rPr>
-          <w:rFonts w:ascii="Times New Roman" w:hAnsi="Times New Roman"/>
-        </w:rPr>
-        <w:t xml:space="preserve"> Pricing </w:t>
-      </w:r>
-      <w:r>
-        <w:rPr>
-          <w:rFonts w:ascii="Times New Roman" w:hAnsi="Times New Roman"/>
-        </w:rPr>
-        <w:t>區塊，目前方案分為</w:t>
+        <w:t>初期市場估算採小規模驗證方式。目前方案分為</w:t>
       </w:r>
       <w:r>
         <w:rPr>
@@ -1858,25 +1900,19 @@
         <w:rPr>
           <w:rFonts w:ascii="Times New Roman" w:hAnsi="Times New Roman"/>
         </w:rPr>
-        <w:t>天對話保留與專屬支援屬商品化方案規</w:t>
+        <w:t>天對話保留與專屬支援屬商品化方案規劃；目前程式碼已支援</w:t>
+      </w:r>
+      <w:r>
+        <w:rPr>
+          <w:rFonts w:ascii="Times New Roman" w:hAnsi="Times New Roman"/>
+        </w:rPr>
+        <w:t xml:space="preserve"> Bot </w:t>
       </w:r>
       <w:r>
         <w:rPr>
           <w:rFonts w:ascii="Times New Roman" w:hAnsi="Times New Roman"/>
         </w:rPr>
         <w:lastRenderedPageBreak/>
-        <w:t>劃；目前程式碼已支援</w:t>
-      </w:r>
-      <w:r>
-        <w:rPr>
-          <w:rFonts w:ascii="Times New Roman" w:hAnsi="Times New Roman"/>
-        </w:rPr>
-        <w:t xml:space="preserve"> Bot </w:t>
-      </w:r>
-      <w:r>
-        <w:rPr>
-          <w:rFonts w:ascii="Times New Roman" w:hAnsi="Times New Roman"/>
-        </w:rPr>
         <w:t>建立、視覺化流程、</w:t>
       </w:r>
       <w:r>

</xml_diff>